<commit_message>
Daftar isi: level 2 (1.1) agak menjorok, level 3 (1.1.1) menjorok lagi
Tiga tingkat (BAB, 1.1, 1.1.1) kini dapat dibedakan di PDF dan Word.

Co-Authored-By: Claude Sonnet 5.5 <noreply@anthropic.com>
</commit_message>
<xml_diff>
--- a/contoh/hasil/proposal.docx
+++ b/contoh/hasil/proposal.docx
@@ -5536,11 +5536,11 @@
     <w:qFormat/>
     <w:pPr>
       <w:tabs>
-        <w:tab w:val="left" w:pos="720"/>
+        <w:tab w:val="left" w:pos="1000"/>
         <w:tab w:val="right" w:leader="dot" w:pos="7937"/>
       </w:tabs>
       <w:spacing w:before="40" w:after="0" w:line="240" w:lineRule="auto"/>
-      <w:ind w:left="0"/>
+      <w:ind w:left="340"/>
     </w:pPr>
   </w:style>
   <w:style w:type="paragraph" w:styleId="TOC3">
@@ -5550,11 +5550,11 @@
     <w:qFormat/>
     <w:pPr>
       <w:tabs>
-        <w:tab w:val="left" w:pos="1600"/>
+        <w:tab w:val="left" w:pos="1800"/>
         <w:tab w:val="right" w:leader="dot" w:pos="7937"/>
       </w:tabs>
       <w:spacing w:before="40" w:after="0" w:line="240" w:lineRule="auto"/>
-      <w:ind w:left="720"/>
+      <w:ind w:left="1000"/>
     </w:pPr>
   </w:style>
   <w:style w:type="paragraph" w:customStyle="1" w:styleId="TableCaption">

</xml_diff>